<commit_message>
Agrego clases Lista, Usuario, Foto
</commit_message>
<xml_diff>
--- a/Informes/Desafio 2 preliminar - Geronimo Cartagena.docx
+++ b/Informes/Desafio 2 preliminar - Geronimo Cartagena.docx
@@ -3291,6 +3291,7 @@
           <w:sz w:val="24"/>
           <w:szCs w:val="24"/>
           <w:highlight w:val="none"/>
+          <w:lang w:val="en-US" w:bidi="en-US"/>
         </w:rPr>
       </w:r>
       <w:r>
@@ -3301,7 +3302,6 @@
           <w:sz w:val="24"/>
           <w:szCs w:val="24"/>
           <w:highlight w:val="none"/>
-          <w:lang w:val="en-US" w:bidi="en-US"/>
         </w:rPr>
       </w:r>
     </w:p>
@@ -3409,10 +3409,9 @@
           <w:sz w:val="24"/>
           <w:szCs w:val="24"/>
           <w:highlight w:val="none"/>
-          <w:lang w:val="en-US" w:bidi="en-US"/>
+          <w:lang w:val="en-US"/>
         </w:rPr>
       </w:r>
-      <w:r/>
       <w:r>
         <w:rPr>
           <w:rFonts w:ascii="Times New Roman" w:hAnsi="Times New Roman" w:eastAsia="Times New Roman" w:cs="Times New Roman"/>
@@ -3424,6 +3423,22 @@
           <w:lang w:val="en-US" w:bidi="en-US"/>
         </w:rPr>
       </w:r>
+    </w:p>
+    <w:p>
+      <w:pPr>
+        <w:pBdr/>
+        <w:spacing/>
+        <w:ind/>
+        <w:jc w:val="left"/>
+        <w:rPr>
+          <w:rFonts w:ascii="Times New Roman" w:hAnsi="Times New Roman" w:eastAsia="Times New Roman" w:cs="Times New Roman"/>
+          <w:b/>
+          <w:bCs/>
+          <w:sz w:val="24"/>
+          <w:szCs w:val="24"/>
+          <w:highlight w:val="none"/>
+        </w:rPr>
+      </w:pPr>
       <w:r>
         <w:rPr>
           <w:rFonts w:ascii="Times New Roman" w:hAnsi="Times New Roman" w:eastAsia="Times New Roman" w:cs="Times New Roman"/>
@@ -3443,7 +3458,92 @@
           <w:sz w:val="24"/>
           <w:szCs w:val="24"/>
           <w:highlight w:val="none"/>
+        </w:rPr>
+      </w:r>
+      <w:r>
+        <w:rPr>
+          <w:rFonts w:ascii="Times New Roman" w:hAnsi="Times New Roman" w:eastAsia="Times New Roman" w:cs="Times New Roman"/>
+          <w:b/>
+          <w:bCs/>
+          <w:sz w:val="24"/>
+          <w:szCs w:val="24"/>
+          <w:highlight w:val="none"/>
+        </w:rPr>
+      </w:r>
+    </w:p>
+    <w:p>
+      <w:pPr>
+        <w:pBdr/>
+        <w:spacing/>
+        <w:ind/>
+        <w:jc w:val="center"/>
+        <w:rPr>
+          <w:rFonts w:ascii="Times New Roman" w:hAnsi="Times New Roman" w:eastAsia="Times New Roman" w:cs="Times New Roman"/>
+          <w:sz w:val="24"/>
+          <w:szCs w:val="24"/>
+          <w:highlight w:val="none"/>
           <w:lang w:val="en-US"/>
+        </w:rPr>
+      </w:pPr>
+      <w:r>
+        <w:rPr>
+          <w:rFonts w:ascii="Times New Roman" w:hAnsi="Times New Roman" w:eastAsia="Times New Roman" w:cs="Times New Roman"/>
+          <w:sz w:val="24"/>
+          <w:szCs w:val="24"/>
+          <w:highlight w:val="none"/>
+          <w:lang w:val="en-US" w:bidi="en-US"/>
+        </w:rPr>
+      </w:r>
+      <w:r>
+        <w:rPr>
+          <w:rFonts w:ascii="Times New Roman" w:hAnsi="Times New Roman" w:eastAsia="Times New Roman" w:cs="Times New Roman"/>
+          <w:sz w:val="24"/>
+          <w:szCs w:val="24"/>
+          <w:highlight w:val="none"/>
+          <w:lang w:val="en-US"/>
+        </w:rPr>
+      </w:r>
+      <w:r>
+        <w:rPr>
+          <w:rFonts w:ascii="Times New Roman" w:hAnsi="Times New Roman" w:eastAsia="Times New Roman" w:cs="Times New Roman"/>
+          <w:sz w:val="24"/>
+          <w:szCs w:val="24"/>
+          <w:highlight w:val="none"/>
+          <w:lang w:val="en-US"/>
+        </w:rPr>
+      </w:r>
+    </w:p>
+    <w:p>
+      <w:pPr>
+        <w:pBdr/>
+        <w:spacing/>
+        <w:ind/>
+        <w:jc w:val="center"/>
+        <w:rPr>
+          <w:rFonts w:ascii="Times New Roman" w:hAnsi="Times New Roman" w:cs="Times New Roman"/>
+          <w:sz w:val="24"/>
+          <w:szCs w:val="24"/>
+        </w:rPr>
+      </w:pPr>
+      <w:r>
+        <w:rPr>
+          <w:rFonts w:ascii="Times New Roman" w:hAnsi="Times New Roman" w:cs="Times New Roman"/>
+          <w:sz w:val="24"/>
+          <w:szCs w:val="24"/>
+        </w:rPr>
+      </w:r>
+      <w:r>
+        <w:rPr>
+          <w:rFonts w:ascii="Times New Roman" w:hAnsi="Times New Roman" w:cs="Times New Roman"/>
+          <w:sz w:val="24"/>
+          <w:szCs w:val="24"/>
+        </w:rPr>
+      </w:r>
+      <w:r>
+        <w:rPr>
+          <w:rFonts w:ascii="Times New Roman" w:hAnsi="Times New Roman" w:cs="Times New Roman"/>
+          <w:sz w:val="24"/>
+          <w:szCs w:val="24"/>
         </w:rPr>
       </w:r>
     </w:p>
@@ -3472,6 +3572,7 @@
           <w:highlight w:val="none"/>
           <w:lang w:val="en-US" w:bidi="en-US"/>
         </w:rPr>
+        <w:t xml:space="preserve">Version extendida  (1.0):</w:t>
       </w:r>
       <w:r>
         <w:rPr>
@@ -3481,7 +3582,6 @@
           <w:sz w:val="24"/>
           <w:szCs w:val="24"/>
           <w:highlight w:val="none"/>
-          <w:lang w:val="en-US" w:bidi="en-US"/>
         </w:rPr>
       </w:r>
       <w:r>
@@ -3500,82 +3600,6 @@
         <w:pBdr/>
         <w:spacing/>
         <w:ind/>
-        <w:jc w:val="center"/>
-        <w:rPr>
-          <w:rFonts w:ascii="Times New Roman" w:hAnsi="Times New Roman" w:eastAsia="Times New Roman" w:cs="Times New Roman"/>
-          <w:sz w:val="24"/>
-          <w:szCs w:val="24"/>
-          <w:highlight w:val="none"/>
-          <w:lang w:val="en-US"/>
-        </w:rPr>
-      </w:pPr>
-      <w:r>
-        <w:rPr>
-          <w:rFonts w:ascii="Times New Roman" w:hAnsi="Times New Roman" w:eastAsia="Times New Roman" w:cs="Times New Roman"/>
-          <w:sz w:val="24"/>
-          <w:szCs w:val="24"/>
-          <w:highlight w:val="none"/>
-          <w:lang w:val="en-US" w:bidi="en-US"/>
-        </w:rPr>
-      </w:r>
-      <w:r>
-        <w:rPr>
-          <w:rFonts w:ascii="Times New Roman" w:hAnsi="Times New Roman" w:eastAsia="Times New Roman" w:cs="Times New Roman"/>
-          <w:sz w:val="24"/>
-          <w:szCs w:val="24"/>
-          <w:highlight w:val="none"/>
-          <w:lang w:val="en-US"/>
-        </w:rPr>
-      </w:r>
-      <w:r>
-        <w:rPr>
-          <w:rFonts w:ascii="Times New Roman" w:hAnsi="Times New Roman" w:eastAsia="Times New Roman" w:cs="Times New Roman"/>
-          <w:sz w:val="24"/>
-          <w:szCs w:val="24"/>
-          <w:highlight w:val="none"/>
-          <w:lang w:val="en-US"/>
-        </w:rPr>
-      </w:r>
-    </w:p>
-    <w:p>
-      <w:pPr>
-        <w:pBdr/>
-        <w:spacing/>
-        <w:ind/>
-        <w:jc w:val="center"/>
-        <w:rPr>
-          <w:rFonts w:ascii="Times New Roman" w:hAnsi="Times New Roman" w:cs="Times New Roman"/>
-          <w:sz w:val="24"/>
-          <w:szCs w:val="24"/>
-        </w:rPr>
-      </w:pPr>
-      <w:r>
-        <w:rPr>
-          <w:rFonts w:ascii="Times New Roman" w:hAnsi="Times New Roman" w:cs="Times New Roman"/>
-          <w:sz w:val="24"/>
-          <w:szCs w:val="24"/>
-        </w:rPr>
-      </w:r>
-      <w:r>
-        <w:rPr>
-          <w:rFonts w:ascii="Times New Roman" w:hAnsi="Times New Roman" w:cs="Times New Roman"/>
-          <w:sz w:val="24"/>
-          <w:szCs w:val="24"/>
-        </w:rPr>
-      </w:r>
-      <w:r>
-        <w:rPr>
-          <w:rFonts w:ascii="Times New Roman" w:hAnsi="Times New Roman" w:cs="Times New Roman"/>
-          <w:sz w:val="24"/>
-          <w:szCs w:val="24"/>
-        </w:rPr>
-      </w:r>
-    </w:p>
-    <w:p>
-      <w:pPr>
-        <w:pBdr/>
-        <w:spacing/>
-        <w:ind/>
         <w:jc w:val="left"/>
         <w:rPr>
           <w:rFonts w:ascii="Times New Roman" w:hAnsi="Times New Roman" w:eastAsia="Times New Roman" w:cs="Times New Roman"/>
@@ -3594,56 +3618,9 @@
           <w:sz w:val="24"/>
           <w:szCs w:val="24"/>
           <w:highlight w:val="none"/>
-          <w:lang w:val="en-US" w:bidi="en-US"/>
-        </w:rPr>
-        <w:t xml:space="preserve">Version extendida  (1.0):</w:t>
+        </w:rPr>
       </w:r>
-      <w:r>
-        <w:rPr>
-          <w:rFonts w:ascii="Times New Roman" w:hAnsi="Times New Roman" w:eastAsia="Times New Roman" w:cs="Times New Roman"/>
-          <w:b/>
-          <w:bCs/>
-          <w:sz w:val="24"/>
-          <w:szCs w:val="24"/>
-          <w:highlight w:val="none"/>
-        </w:rPr>
-      </w:r>
-      <w:r>
-        <w:rPr>
-          <w:rFonts w:ascii="Times New Roman" w:hAnsi="Times New Roman" w:eastAsia="Times New Roman" w:cs="Times New Roman"/>
-          <w:b/>
-          <w:bCs/>
-          <w:sz w:val="24"/>
-          <w:szCs w:val="24"/>
-          <w:highlight w:val="none"/>
-        </w:rPr>
-      </w:r>
-    </w:p>
-    <w:p>
-      <w:pPr>
-        <w:pBdr/>
-        <w:spacing/>
-        <w:ind/>
-        <w:jc w:val="left"/>
-        <w:rPr>
-          <w:rFonts w:ascii="Times New Roman" w:hAnsi="Times New Roman" w:eastAsia="Times New Roman" w:cs="Times New Roman"/>
-          <w:b/>
-          <w:bCs/>
-          <w:sz w:val="24"/>
-          <w:szCs w:val="24"/>
-          <w:highlight w:val="none"/>
-        </w:rPr>
-      </w:pPr>
-      <w:r>
-        <w:rPr>
-          <w:rFonts w:ascii="Times New Roman" w:hAnsi="Times New Roman" w:eastAsia="Times New Roman" w:cs="Times New Roman"/>
-          <w:b/>
-          <w:bCs/>
-          <w:sz w:val="24"/>
-          <w:szCs w:val="24"/>
-          <w:highlight w:val="none"/>
-        </w:rPr>
-      </w:r>
+      <w:r/>
       <w:r>
         <mc:AlternateContent>
           <mc:Choice Requires="wpg">
@@ -3659,7 +3636,7 @@
                   <a:graphicData uri="http://schemas.openxmlformats.org/drawingml/2006/picture">
                     <pic:pic xmlns:pic="http://schemas.openxmlformats.org/drawingml/2006/picture">
                       <pic:nvPicPr>
-                        <pic:cNvPr id="31260021" name=""/>
+                        <pic:cNvPr id="1277102084" name=""/>
                         <pic:cNvPicPr>
                           <a:picLocks noChangeAspect="1"/>
                         </pic:cNvPicPr>
@@ -3672,7 +3649,7 @@
                       <pic:spPr bwMode="auto">
                         <a:xfrm>
                           <a:off x="0" y="0"/>
-                          <a:ext cx="5940424" cy="8699770"/>
+                          <a:ext cx="5940423" cy="8699769"/>
                         </a:xfrm>
                         <a:prstGeom prst="rect">
                           <a:avLst/>
@@ -3713,49 +3690,7 @@
           </mc:Fallback>
         </mc:AlternateContent>
       </w:r>
-      <w:r>
-        <w:rPr>
-          <w:rFonts w:ascii="Times New Roman" w:hAnsi="Times New Roman" w:eastAsia="Times New Roman" w:cs="Times New Roman"/>
-          <w:b/>
-          <w:bCs/>
-          <w:sz w:val="24"/>
-          <w:szCs w:val="24"/>
-          <w:highlight w:val="none"/>
-        </w:rPr>
-      </w:r>
       <w:r/>
-      <w:r>
-        <w:rPr>
-          <w:rFonts w:ascii="Times New Roman" w:hAnsi="Times New Roman" w:eastAsia="Times New Roman" w:cs="Times New Roman"/>
-          <w:b/>
-          <w:bCs/>
-          <w:sz w:val="24"/>
-          <w:szCs w:val="24"/>
-          <w:highlight w:val="none"/>
-        </w:rPr>
-      </w:r>
-      <w:r/>
-      <w:r>
-        <w:rPr>
-          <w:rFonts w:ascii="Times New Roman" w:hAnsi="Times New Roman" w:eastAsia="Times New Roman" w:cs="Times New Roman"/>
-          <w:b/>
-          <w:bCs/>
-          <w:sz w:val="24"/>
-          <w:szCs w:val="24"/>
-          <w:highlight w:val="none"/>
-        </w:rPr>
-      </w:r>
-      <w:r/>
-      <w:r>
-        <w:rPr>
-          <w:rFonts w:ascii="Times New Roman" w:hAnsi="Times New Roman" w:eastAsia="Times New Roman" w:cs="Times New Roman"/>
-          <w:b/>
-          <w:bCs/>
-          <w:sz w:val="24"/>
-          <w:szCs w:val="24"/>
-          <w:highlight w:val="none"/>
-        </w:rPr>
-      </w:r>
       <w:r>
         <w:rPr>
           <w:rFonts w:ascii="Times New Roman" w:hAnsi="Times New Roman" w:eastAsia="Times New Roman" w:cs="Times New Roman"/>

</xml_diff>